<commit_message>
replace/merge comment option added; 06/02/2026 v1.5
</commit_message>
<xml_diff>
--- a/project/docs/ISPRA Event Manager manual.docx
+++ b/project/docs/ISPRA Event Manager manual.docx
@@ -28,7 +28,128 @@
         <w:pStyle w:val="Heading1"/>
       </w:pPr>
       <w:r>
+        <w:t>CHANGES LIST</w:t>
+      </w:r>
+    </w:p>
+    <w:p>
+      <w:pPr>
+        <w:jc w:val="both"/>
+        <w:rPr>
+          <w:b/>
+          <w:bCs/>
+          <w:color w:val="EE0000"/>
+        </w:rPr>
+      </w:pPr>
+      <w:r>
+        <w:rPr>
+          <w:b/>
+          <w:bCs/>
+          <w:color w:val="EE0000"/>
+        </w:rPr>
+        <w:t>V1.5 06/02/2026</w:t>
+      </w:r>
+    </w:p>
+    <w:p>
+      <w:pPr>
+        <w:jc w:val="both"/>
+      </w:pPr>
+      <w:r>
+        <w:t xml:space="preserve">Added option to select Replace/Merge comments from comments table to events table. </w:t>
+      </w:r>
+    </w:p>
+    <w:p>
+      <w:pPr>
+        <w:jc w:val="both"/>
+      </w:pPr>
+      <w:r>
+        <w:t>If option Replace selected, text in the selected field of events table will be cleared and replaced with text from selected fields of comments table.</w:t>
+      </w:r>
+    </w:p>
+    <w:p>
+      <w:pPr>
+        <w:jc w:val="both"/>
+      </w:pPr>
+      <w:r>
+        <w:t>If option Merge selected, text from the comments table will be concatenated to text in events table with the specified separator.</w:t>
+      </w:r>
+    </w:p>
+    <w:p>
+      <w:pPr>
+        <w:jc w:val="both"/>
+      </w:pPr>
+      <w:r>
+        <w:t xml:space="preserve">This only applies to coupled events. If no corresponding </w:t>
+      </w:r>
+      <w:r>
+        <w:t>entry</w:t>
+      </w:r>
+      <w:r>
+        <w:t xml:space="preserve"> in the comment table, the entry will not be </w:t>
+      </w:r>
+      <w:r>
+        <w:t>changed</w:t>
+      </w:r>
+      <w:r>
+        <w:t>.</w:t>
+      </w:r>
+    </w:p>
+    <w:p>
+      <w:pPr>
+        <w:jc w:val="center"/>
+      </w:pPr>
+      <w:r>
+        <w:drawing>
+          <wp:inline distT="0" distB="0" distL="0" distR="0" wp14:anchorId="5314092B" wp14:editId="11BEAD51">
+            <wp:extent cx="6645910" cy="2791460"/>
+            <wp:effectExtent l="0" t="0" r="2540" b="8890"/>
+            <wp:docPr id="1547622153" name="Picture 1"/>
+            <wp:cNvGraphicFramePr>
+              <a:graphicFrameLocks xmlns:a="http://schemas.openxmlformats.org/drawingml/2006/main" noChangeAspect="1"/>
+            </wp:cNvGraphicFramePr>
+            <a:graphic xmlns:a="http://schemas.openxmlformats.org/drawingml/2006/main">
+              <a:graphicData uri="http://schemas.openxmlformats.org/drawingml/2006/picture">
+                <pic:pic xmlns:pic="http://schemas.openxmlformats.org/drawingml/2006/picture">
+                  <pic:nvPicPr>
+                    <pic:cNvPr id="1547622153" name=""/>
+                    <pic:cNvPicPr/>
+                  </pic:nvPicPr>
+                  <pic:blipFill>
+                    <a:blip r:embed="rId5"/>
+                    <a:stretch>
+                      <a:fillRect/>
+                    </a:stretch>
+                  </pic:blipFill>
+                  <pic:spPr>
+                    <a:xfrm>
+                      <a:off x="0" y="0"/>
+                      <a:ext cx="6645910" cy="2791460"/>
+                    </a:xfrm>
+                    <a:prstGeom prst="rect">
+                      <a:avLst/>
+                    </a:prstGeom>
+                  </pic:spPr>
+                </pic:pic>
+              </a:graphicData>
+            </a:graphic>
+          </wp:inline>
+        </w:drawing>
+      </w:r>
+    </w:p>
+    <w:p>
+      <w:r>
+        <w:br w:type="page"/>
+      </w:r>
+    </w:p>
+    <w:p>
+      <w:pPr>
+        <w:pStyle w:val="Heading1"/>
+      </w:pPr>
+      <w:r>
+        <w:lastRenderedPageBreak/>
         <w:t>ISPRA EVENT MANAGER</w:t>
+      </w:r>
+      <w:r>
+        <w:t xml:space="preserve"> v1.4 30/01/2026</w:t>
       </w:r>
     </w:p>
     <w:p>
@@ -126,7 +247,7 @@
                     </pic:cNvPicPr>
                   </pic:nvPicPr>
                   <pic:blipFill>
-                    <a:blip r:embed="rId5">
+                    <a:blip r:embed="rId6">
                       <a:extLst>
                         <a:ext uri="{28A0092B-C50C-407E-A947-70E740481C1C}">
                           <a14:useLocalDpi xmlns:a14="http://schemas.microsoft.com/office/drawing/2010/main" val="0"/>
@@ -219,7 +340,7 @@
                     </pic:cNvPicPr>
                   </pic:nvPicPr>
                   <pic:blipFill>
-                    <a:blip r:embed="rId6">
+                    <a:blip r:embed="rId7">
                       <a:extLst>
                         <a:ext uri="{28A0092B-C50C-407E-A947-70E740481C1C}">
                           <a14:useLocalDpi xmlns:a14="http://schemas.microsoft.com/office/drawing/2010/main" val="0"/>
@@ -306,6 +427,9 @@
         <w:jc w:val="center"/>
       </w:pPr>
       <w:r>
+        <w:rPr>
+          <w:noProof/>
+        </w:rPr>
         <w:drawing>
           <wp:inline distT="0" distB="0" distL="0" distR="0" wp14:anchorId="1425467E" wp14:editId="750DFF5A">
             <wp:extent cx="1895740" cy="1009791"/>
@@ -322,7 +446,7 @@
                     <pic:cNvPicPr/>
                   </pic:nvPicPr>
                   <pic:blipFill>
-                    <a:blip r:embed="rId7"/>
+                    <a:blip r:embed="rId8"/>
                     <a:stretch>
                       <a:fillRect/>
                     </a:stretch>
@@ -343,6 +467,9 @@
         </w:drawing>
       </w:r>
       <w:r>
+        <w:rPr>
+          <w:noProof/>
+        </w:rPr>
         <w:drawing>
           <wp:inline distT="0" distB="0" distL="0" distR="0" wp14:anchorId="14C6F73D" wp14:editId="300789F2">
             <wp:extent cx="2372056" cy="762106"/>
@@ -359,7 +486,7 @@
                     <pic:cNvPicPr/>
                   </pic:nvPicPr>
                   <pic:blipFill>
-                    <a:blip r:embed="rId8"/>
+                    <a:blip r:embed="rId9"/>
                     <a:stretch>
                       <a:fillRect/>
                     </a:stretch>
@@ -545,7 +672,7 @@
           <w:noProof/>
         </w:rPr>
         <w:drawing>
-          <wp:inline distT="0" distB="0" distL="0" distR="0" wp14:anchorId="28BA018A" wp14:editId="49F3CE6C">
+          <wp:inline distT="0" distB="0" distL="0" distR="0" wp14:anchorId="28BA018A" wp14:editId="364386F8">
             <wp:extent cx="6806782" cy="2321781"/>
             <wp:effectExtent l="0" t="0" r="0" b="2540"/>
             <wp:docPr id="376203149" name="Picture 4"/>
@@ -562,7 +689,7 @@
                     </pic:cNvPicPr>
                   </pic:nvPicPr>
                   <pic:blipFill>
-                    <a:blip r:embed="rId9" cstate="print">
+                    <a:blip r:embed="rId10" cstate="print">
                       <a:extLst>
                         <a:ext uri="{28A0092B-C50C-407E-A947-70E740481C1C}">
                           <a14:useLocalDpi xmlns:a14="http://schemas.microsoft.com/office/drawing/2010/main" val="0"/>
@@ -604,13 +731,7 @@
         <w:jc w:val="both"/>
       </w:pPr>
       <w:r>
-        <w:t xml:space="preserve">Select </w:t>
-      </w:r>
-      <w:r>
-        <w:t>exported events file</w:t>
-      </w:r>
-      <w:r>
-        <w:t>.</w:t>
+        <w:t>Select exported events file.</w:t>
       </w:r>
     </w:p>
     <w:p>
@@ -733,6 +854,9 @@
         <w:jc w:val="center"/>
       </w:pPr>
       <w:r>
+        <w:rPr>
+          <w:noProof/>
+        </w:rPr>
         <w:drawing>
           <wp:inline distT="0" distB="0" distL="0" distR="0" wp14:anchorId="0CB1E995" wp14:editId="70BD9A3A">
             <wp:extent cx="6645910" cy="697230"/>
@@ -749,7 +873,7 @@
                     <pic:cNvPicPr/>
                   </pic:nvPicPr>
                   <pic:blipFill>
-                    <a:blip r:embed="rId10"/>
+                    <a:blip r:embed="rId11"/>
                     <a:stretch>
                       <a:fillRect/>
                     </a:stretch>
@@ -820,6 +944,9 @@
         <w:jc w:val="center"/>
       </w:pPr>
       <w:r>
+        <w:rPr>
+          <w:noProof/>
+        </w:rPr>
         <w:drawing>
           <wp:inline distT="0" distB="0" distL="0" distR="0" wp14:anchorId="5D2CF3B1" wp14:editId="208DA6FE">
             <wp:extent cx="990738" cy="1009791"/>
@@ -836,7 +963,7 @@
                     <pic:cNvPicPr/>
                   </pic:nvPicPr>
                   <pic:blipFill>
-                    <a:blip r:embed="rId11"/>
+                    <a:blip r:embed="rId12"/>
                     <a:stretch>
                       <a:fillRect/>
                     </a:stretch>
@@ -863,6 +990,9 @@
         <w:t xml:space="preserve"> </w:t>
       </w:r>
       <w:r>
+        <w:rPr>
+          <w:noProof/>
+        </w:rPr>
         <w:drawing>
           <wp:inline distT="0" distB="0" distL="0" distR="0" wp14:anchorId="699E2344" wp14:editId="72BBC8A9">
             <wp:extent cx="2629267" cy="1009791"/>
@@ -879,7 +1009,7 @@
                     <pic:cNvPicPr/>
                   </pic:nvPicPr>
                   <pic:blipFill>
-                    <a:blip r:embed="rId12"/>
+                    <a:blip r:embed="rId13"/>
                     <a:stretch>
                       <a:fillRect/>
                     </a:stretch>
@@ -913,23 +1043,7 @@
           <w:bCs/>
           <w:color w:val="EE0000"/>
         </w:rPr>
-        <w:t xml:space="preserve">NOTE! You may need to adjust </w:t>
-      </w:r>
-      <w:r>
-        <w:rPr>
-          <w:b/>
-          <w:bCs/>
-          <w:color w:val="EE0000"/>
-        </w:rPr>
-        <w:t>‘Max time variation’</w:t>
-      </w:r>
-      <w:r>
-        <w:rPr>
-          <w:b/>
-          <w:bCs/>
-          <w:color w:val="EE0000"/>
-        </w:rPr>
-        <w:t xml:space="preserve"> if noted comments are further in time from the logged VisualSoft events.</w:t>
+        <w:t>NOTE! You may need to adjust ‘Max time variation’ if noted comments are further in time from the logged VisualSoft events.</w:t>
       </w:r>
     </w:p>
     <w:p>
@@ -1006,6 +1120,9 @@
         <w:jc w:val="center"/>
       </w:pPr>
       <w:r>
+        <w:rPr>
+          <w:noProof/>
+        </w:rPr>
         <w:lastRenderedPageBreak/>
         <w:drawing>
           <wp:inline distT="0" distB="0" distL="0" distR="0" wp14:anchorId="46298F0F" wp14:editId="2692CC98">
@@ -1023,7 +1140,7 @@
                     <pic:cNvPicPr/>
                   </pic:nvPicPr>
                   <pic:blipFill>
-                    <a:blip r:embed="rId13"/>
+                    <a:blip r:embed="rId14"/>
                     <a:stretch>
                       <a:fillRect/>
                     </a:stretch>
@@ -1090,6 +1207,9 @@
         <w:jc w:val="center"/>
       </w:pPr>
       <w:r>
+        <w:rPr>
+          <w:noProof/>
+        </w:rPr>
         <w:drawing>
           <wp:inline distT="0" distB="0" distL="0" distR="0" wp14:anchorId="11ED65D0" wp14:editId="32B8BD65">
             <wp:extent cx="4341362" cy="2880000"/>
@@ -1106,7 +1226,7 @@
                     <pic:cNvPicPr/>
                   </pic:nvPicPr>
                   <pic:blipFill>
-                    <a:blip r:embed="rId14"/>
+                    <a:blip r:embed="rId15"/>
                     <a:stretch>
                       <a:fillRect/>
                     </a:stretch>
@@ -1168,6 +1288,9 @@
         <w:jc w:val="center"/>
       </w:pPr>
       <w:r>
+        <w:rPr>
+          <w:noProof/>
+        </w:rPr>
         <w:drawing>
           <wp:inline distT="0" distB="0" distL="0" distR="0" wp14:anchorId="4B2DEF4C" wp14:editId="3C421D69">
             <wp:extent cx="2553056" cy="1295581"/>
@@ -1184,7 +1307,7 @@
                     <pic:cNvPicPr/>
                   </pic:nvPicPr>
                   <pic:blipFill>
-                    <a:blip r:embed="rId15"/>
+                    <a:blip r:embed="rId16"/>
                     <a:stretch>
                       <a:fillRect/>
                     </a:stretch>
@@ -4222,31 +4345,7 @@
                 <w:lang w:eastAsia="en-GB"/>
                 <w14:ligatures w14:val="none"/>
               </w:rPr>
-              <w:t>Fie</w:t>
-            </w:r>
-            <w:r>
-              <w:rPr>
-                <w:rFonts w:eastAsia="Times New Roman" w:cstheme="minorHAnsi"/>
-                <w:color w:val="000000"/>
-                <w:kern w:val="0"/>
-                <w:sz w:val="16"/>
-                <w:szCs w:val="16"/>
-                <w:lang w:eastAsia="en-GB"/>
-                <w14:ligatures w14:val="none"/>
-              </w:rPr>
-              <w:t>l</w:t>
-            </w:r>
-            <w:r>
-              <w:rPr>
-                <w:rFonts w:eastAsia="Times New Roman" w:cstheme="minorHAnsi"/>
-                <w:color w:val="000000"/>
-                <w:kern w:val="0"/>
-                <w:sz w:val="16"/>
-                <w:szCs w:val="16"/>
-                <w:lang w:eastAsia="en-GB"/>
-                <w14:ligatures w14:val="none"/>
-              </w:rPr>
-              <w:t>ds to merge from comments table</w:t>
+              <w:t>Fields to merge from comments table</w:t>
             </w:r>
           </w:p>
         </w:tc>
@@ -4580,31 +4679,7 @@
                 <w:lang w:eastAsia="en-GB"/>
                 <w14:ligatures w14:val="none"/>
               </w:rPr>
-              <w:t>Comments merged fie</w:t>
-            </w:r>
-            <w:r>
-              <w:rPr>
-                <w:rFonts w:eastAsia="Times New Roman" w:cstheme="minorHAnsi"/>
-                <w:color w:val="000000"/>
-                <w:kern w:val="0"/>
-                <w:sz w:val="16"/>
-                <w:szCs w:val="16"/>
-                <w:lang w:eastAsia="en-GB"/>
-                <w14:ligatures w14:val="none"/>
-              </w:rPr>
-              <w:t>l</w:t>
-            </w:r>
-            <w:r>
-              <w:rPr>
-                <w:rFonts w:eastAsia="Times New Roman" w:cstheme="minorHAnsi"/>
-                <w:color w:val="000000"/>
-                <w:kern w:val="0"/>
-                <w:sz w:val="16"/>
-                <w:szCs w:val="16"/>
-                <w:lang w:eastAsia="en-GB"/>
-                <w14:ligatures w14:val="none"/>
-              </w:rPr>
-              <w:t>ds separator</w:t>
+              <w:t>Comments merged fields separator</w:t>
             </w:r>
           </w:p>
         </w:tc>
@@ -5597,6 +5672,7 @@
   <w:style w:type="character" w:default="1" w:styleId="DefaultParagraphFont">
     <w:name w:val="Default Paragraph Font"/>
     <w:uiPriority w:val="1"/>
+    <w:semiHidden/>
     <w:unhideWhenUsed/>
   </w:style>
   <w:style w:type="table" w:default="1" w:styleId="TableNormal">

</xml_diff>